<commit_message>
feat(patent & design): finalize statutory patent drawings and design registration docs, add standard templates, and update web avatar paths
</commit_message>
<xml_diff>
--- a/DESIGN_REGISTRATION/OTHER_DOCUMENTS_AD47_our_project.docx
+++ b/DESIGN_REGISTRATION/OTHER_DOCUMENTS_AD47_our_project.docx
@@ -81,7 +81,7 @@
           <w:szCs w:val="24"/>
           <w:highlight w:val="yellow"/>
         </w:rPr>
-        <w:t>EDGE-AI SIGN LANGUAGE TRANSLATION APPARATUS</w:t>
+        <w:t>EDGE-AI SIGN LANGUAGE TRANSLATION KIOSK WITH WIRELESS SENSOR GLOVE</w:t>
       </w:r>
       <w:r>
         <w:rPr>
@@ -137,7 +137,7 @@
           <w:szCs w:val="24"/>
           <w:highlight w:val="yellow"/>
         </w:rPr>
-        <w:t>The present design relates to a standalone, portable Edge-AI sign language translation apparatus comprising an ergonomic integrated housing, an optical sensor and illumination pod, a front interactive display screen for dynamic 3D sign demonstrations and subtitles, directional acoustic ports, rear thermal exhaust vents, and a stable beveled pedestal base for hands-free counter and desktop operation</w:t>
+        <w:t>The present design relates to a portable counter-top Edge-AI sign language translation kiosk with a companion wireless sensor glove. The kiosk comprises a compact box-shaped enclosure with an angled privacy hood housing an integrated depth camera and dual MEMS microphone array, a front-facing 10-inch angled touchscreen display for dynamic 3D sign avatar demonstrations and real-time subtitles, a directional speaker grille, rear thermal exhaust ventilation, I/O bay with IEC power inlet, Ethernet and Kensington lock, and a heavy anti-tip weighted base with cable management channel and anti-slip rubber feet. The companion wireless sensor glove features five resistive flex sensors along each finger dorsum, a 9-axis IMU (accelerometer, gyroscope, magnetometer) on a wrist-mounted PCB module, Bluetooth Low Energy transmitter, rechargeable LiPo cell, LED status indicator, and an adjustable velcro wrist closure strap</w:t>
       </w:r>
       <w:r>
         <w:rPr>
@@ -210,7 +210,7 @@
           <w:szCs w:val="24"/>
           <w:highlight w:val="yellow"/>
         </w:rPr>
-        <w:t>EDGE-AI SIGN LANGUAGE TRANSLATION APPARATUS</w:t>
+        <w:t>EDGE-AI SIGN LANGUAGE TRANSLATION KIOSK WITH WIRELESS SENSOR GLOVE</w:t>
       </w:r>
       <w:r>
         <w:rPr>

</xml_diff>